<commit_message>
Update Actividad 2.4 - Pablo González García.docx
</commit_message>
<xml_diff>
--- a/DAW/UT2/Ejercicios/EJ2.4/Actividad 2.4 - Pablo González García.docx
+++ b/DAW/UT2/Ejercicios/EJ2.4/Actividad 2.4 - Pablo González García.docx
@@ -80,11 +80,6 @@
     </w:p>
     <w:p>
       <w:pPr>
-        <w:ind w:left="720"/>
-      </w:pPr>
-    </w:p>
-    <w:p>
-      <w:pPr>
         <w:numPr>
           <w:ilvl w:val="0"/>
           <w:numId w:val="1"/>
@@ -96,11 +91,6 @@
     </w:p>
     <w:p>
       <w:pPr>
-        <w:ind w:left="360"/>
-      </w:pPr>
-    </w:p>
-    <w:p>
-      <w:pPr>
         <w:numPr>
           <w:ilvl w:val="0"/>
           <w:numId w:val="1"/>
@@ -132,6 +122,9 @@
         <w:ind w:left="360"/>
       </w:pPr>
       <w:r>
+        <w:rPr>
+          <w:noProof/>
+        </w:rPr>
         <w:drawing>
           <wp:inline distT="0" distB="0" distL="0" distR="0" wp14:anchorId="5997A1A4" wp14:editId="3A1C230B">
             <wp:extent cx="5400040" cy="1762760"/>
@@ -203,6 +196,9 @@
         </w:rPr>
       </w:pPr>
       <w:r>
+        <w:rPr>
+          <w:noProof/>
+        </w:rPr>
         <w:lastRenderedPageBreak/>
         <w:drawing>
           <wp:inline distT="0" distB="0" distL="0" distR="0" wp14:anchorId="0E01726C" wp14:editId="15B261AD">
@@ -255,6 +251,9 @@
     </w:p>
     <w:p>
       <w:r>
+        <w:rPr>
+          <w:noProof/>
+        </w:rPr>
         <w:drawing>
           <wp:inline distT="0" distB="0" distL="0" distR="0" wp14:anchorId="46F72264" wp14:editId="75D271F8">
             <wp:extent cx="5400040" cy="2640965"/>
@@ -294,6 +293,9 @@
     </w:p>
     <w:p>
       <w:r>
+        <w:rPr>
+          <w:noProof/>
+        </w:rPr>
         <w:lastRenderedPageBreak/>
         <w:drawing>
           <wp:inline distT="0" distB="0" distL="0" distR="0" wp14:anchorId="33067D93" wp14:editId="30716C99">
@@ -360,6 +362,9 @@
         </w:rPr>
       </w:pPr>
       <w:r>
+        <w:rPr>
+          <w:noProof/>
+        </w:rPr>
         <w:drawing>
           <wp:inline distT="0" distB="0" distL="0" distR="0" wp14:anchorId="176426B2" wp14:editId="28D86C9E">
             <wp:extent cx="5400040" cy="3759200"/>
@@ -412,6 +417,9 @@
         </w:rPr>
       </w:pPr>
       <w:r>
+        <w:rPr>
+          <w:noProof/>
+        </w:rPr>
         <w:lastRenderedPageBreak/>
         <w:drawing>
           <wp:inline distT="0" distB="0" distL="0" distR="0" wp14:anchorId="47B0FAD4" wp14:editId="789E2A24">
@@ -459,6 +467,14 @@
     </w:p>
     <w:p>
       <w:r>
+        <w:t>Descargamos el wordpress y modificamos los archivos necesarios para que todo funcione correctamente cambiando permisos…</w:t>
+      </w:r>
+    </w:p>
+    <w:p>
+      <w:r>
+        <w:rPr>
+          <w:noProof/>
+        </w:rPr>
         <w:drawing>
           <wp:inline distT="0" distB="0" distL="0" distR="0" wp14:anchorId="48E67875" wp14:editId="7371AD66">
             <wp:extent cx="5400040" cy="1377950"/>
@@ -496,6 +512,9 @@
         </w:drawing>
       </w:r>
       <w:r>
+        <w:rPr>
+          <w:noProof/>
+        </w:rPr>
         <w:drawing>
           <wp:inline distT="0" distB="0" distL="0" distR="0" wp14:anchorId="2909AF40" wp14:editId="7394F553">
             <wp:extent cx="4515480" cy="247685"/>
@@ -535,6 +554,9 @@
     </w:p>
     <w:p>
       <w:r>
+        <w:rPr>
+          <w:noProof/>
+        </w:rPr>
         <w:drawing>
           <wp:inline distT="0" distB="0" distL="0" distR="0" wp14:anchorId="326476D2" wp14:editId="532F2F01">
             <wp:extent cx="4963218" cy="209579"/>
@@ -572,9 +594,9 @@
         </w:drawing>
       </w:r>
       <w:r>
-        <w:t xml:space="preserve">sudo </w:t>
-      </w:r>
-      <w:r>
+        <w:rPr>
+          <w:noProof/>
+        </w:rPr>
         <w:drawing>
           <wp:inline distT="0" distB="0" distL="0" distR="0" wp14:anchorId="24432448" wp14:editId="421A5AF7">
             <wp:extent cx="5400040" cy="229235"/>
@@ -614,6 +636,10 @@
     </w:p>
     <w:p>
       <w:r>
+        <w:rPr>
+          <w:noProof/>
+        </w:rPr>
+        <w:lastRenderedPageBreak/>
         <w:drawing>
           <wp:inline distT="0" distB="0" distL="0" distR="0" wp14:anchorId="1C8DB1FC" wp14:editId="002B2E2D">
             <wp:extent cx="5400040" cy="171450"/>
@@ -651,6 +677,9 @@
         </w:drawing>
       </w:r>
       <w:r>
+        <w:rPr>
+          <w:noProof/>
+        </w:rPr>
         <w:drawing>
           <wp:inline distT="0" distB="0" distL="0" distR="0" wp14:anchorId="61F4FF57" wp14:editId="0EF4A65E">
             <wp:extent cx="5353797" cy="219106"/>
@@ -700,12 +729,14 @@
           <w:b/>
           <w:bCs/>
         </w:rPr>
-        <w:lastRenderedPageBreak/>
         <w:t>8. Configurar WordPress</w:t>
       </w:r>
     </w:p>
     <w:p>
       <w:r>
+        <w:rPr>
+          <w:noProof/>
+        </w:rPr>
         <w:drawing>
           <wp:inline distT="0" distB="0" distL="0" distR="0" wp14:anchorId="27B1A215" wp14:editId="1A50F912">
             <wp:extent cx="5400040" cy="435610"/>
@@ -742,9 +773,6 @@
           </wp:inline>
         </w:drawing>
       </w:r>
-      <w:r>
-        <w:t>sudo nano wp-config.php</w:t>
-      </w:r>
     </w:p>
     <w:p>
       <w:r>
@@ -762,6 +790,7 @@
         <w:rPr>
           <w:b/>
           <w:bCs/>
+          <w:noProof/>
         </w:rPr>
         <w:drawing>
           <wp:inline distT="0" distB="0" distL="0" distR="0" wp14:anchorId="3F0FBFAE" wp14:editId="183B855C">
@@ -813,6 +842,11 @@
       </w:r>
     </w:p>
     <w:p>
+      <w:r>
+        <w:t>http://IP-PUBLICA/wp-admin</w:t>
+      </w:r>
+    </w:p>
+    <w:p>
       <w:pPr>
         <w:rPr>
           <w:b/>
@@ -820,6 +854,9 @@
         </w:rPr>
       </w:pPr>
       <w:r>
+        <w:rPr>
+          <w:noProof/>
+        </w:rPr>
         <w:lastRenderedPageBreak/>
         <w:drawing>
           <wp:inline distT="0" distB="0" distL="0" distR="0" wp14:anchorId="7C19FD25" wp14:editId="0A34E9BD">
@@ -867,6 +904,17 @@
     </w:p>
     <w:p>
       <w:r>
+        <w:t>Creamos el archivo con sudo nano</w:t>
+      </w:r>
+      <w:r>
+        <w:t xml:space="preserve"> y creamos dentro el script indicado</w:t>
+      </w:r>
+    </w:p>
+    <w:p>
+      <w:r>
+        <w:rPr>
+          <w:noProof/>
+        </w:rPr>
         <w:lastRenderedPageBreak/>
         <w:drawing>
           <wp:inline distT="0" distB="0" distL="0" distR="0" wp14:anchorId="7899EA83" wp14:editId="38BB9D77">
@@ -905,7 +953,13 @@
         </w:drawing>
       </w:r>
       <w:r>
-        <w:t>Dar permisos de ejecución:</w:t>
+        <w:t>Dar permisos de ejecución</w:t>
+      </w:r>
+      <w:r>
+        <w:t xml:space="preserve"> al archivo que acabamos de crear</w:t>
+      </w:r>
+      <w:r>
+        <w:t>:</w:t>
       </w:r>
     </w:p>
     <w:p>
@@ -916,6 +970,9 @@
         </w:rPr>
       </w:pPr>
       <w:r>
+        <w:rPr>
+          <w:noProof/>
+        </w:rPr>
         <w:drawing>
           <wp:inline distT="0" distB="0" distL="0" distR="0" wp14:anchorId="64481DC9" wp14:editId="3DAB9291">
             <wp:extent cx="5353797" cy="362001"/>
@@ -955,11 +1012,20 @@
     </w:p>
     <w:p>
       <w:r>
-        <w:t>Ejecuto el script:</w:t>
-      </w:r>
-    </w:p>
-    <w:p>
-      <w:r>
+        <w:t>Ejecuto el script</w:t>
+      </w:r>
+      <w:r>
+        <w:t xml:space="preserve"> que nos debería mostrar el estado de nuestro servidor apache y de nuestro servidor de bases de datos en este caso MYSQL</w:t>
+      </w:r>
+      <w:r>
+        <w:t>:</w:t>
+      </w:r>
+    </w:p>
+    <w:p>
+      <w:r>
+        <w:rPr>
+          <w:noProof/>
+        </w:rPr>
         <w:drawing>
           <wp:inline distT="0" distB="0" distL="0" distR="0" wp14:anchorId="56E6CD5F" wp14:editId="6F6195CB">
             <wp:extent cx="5239481" cy="581106"/>
@@ -995,81 +1061,6 @@
             </a:graphic>
           </wp:inline>
         </w:drawing>
-      </w:r>
-    </w:p>
-    <w:p>
-      <w:pPr>
-        <w:rPr>
-          <w:b/>
-          <w:bCs/>
-        </w:rPr>
-      </w:pPr>
-      <w:r>
-        <w:rPr>
-          <w:b/>
-          <w:bCs/>
-        </w:rPr>
-        <w:t>Documentación requerida</w:t>
-      </w:r>
-    </w:p>
-    <w:p>
-      <w:r>
-        <w:t>Debes incluir capturas de:</w:t>
-      </w:r>
-    </w:p>
-    <w:p>
-      <w:pPr>
-        <w:numPr>
-          <w:ilvl w:val="0"/>
-          <w:numId w:val="2"/>
-        </w:numPr>
-      </w:pPr>
-      <w:r>
-        <w:t>Apache funcionando</w:t>
-      </w:r>
-    </w:p>
-    <w:p>
-      <w:pPr>
-        <w:numPr>
-          <w:ilvl w:val="0"/>
-          <w:numId w:val="2"/>
-        </w:numPr>
-      </w:pPr>
-      <w:r>
-        <w:t>MySQL accesible</w:t>
-      </w:r>
-    </w:p>
-    <w:p>
-      <w:pPr>
-        <w:numPr>
-          <w:ilvl w:val="0"/>
-          <w:numId w:val="2"/>
-        </w:numPr>
-      </w:pPr>
-      <w:r>
-        <w:t>Archivo wp-config.php editado</w:t>
-      </w:r>
-    </w:p>
-    <w:p>
-      <w:pPr>
-        <w:numPr>
-          <w:ilvl w:val="0"/>
-          <w:numId w:val="2"/>
-        </w:numPr>
-      </w:pPr>
-      <w:r>
-        <w:t>Panel de WordPress instalado</w:t>
-      </w:r>
-    </w:p>
-    <w:p>
-      <w:pPr>
-        <w:numPr>
-          <w:ilvl w:val="0"/>
-          <w:numId w:val="2"/>
-        </w:numPr>
-      </w:pPr>
-      <w:r>
-        <w:t>Script comprobacion_servicios.sh mostrando estado de servicios</w:t>
       </w:r>
     </w:p>
     <w:p/>
@@ -2084,6 +2075,7 @@
   <w:style w:type="character" w:default="1" w:styleId="Fuentedeprrafopredeter">
     <w:name w:val="Default Paragraph Font"/>
     <w:uiPriority w:val="1"/>
+    <w:semiHidden/>
     <w:unhideWhenUsed/>
   </w:style>
   <w:style w:type="table" w:default="1" w:styleId="Tablanormal">
@@ -2542,6 +2534,9 @@
     <w:rsid w:val="00125D8A"/>
     <w:rsid w:val="001E7474"/>
     <w:rsid w:val="003765CC"/>
+    <w:rsid w:val="003C47D3"/>
+    <w:rsid w:val="00A91FD2"/>
+    <w:rsid w:val="00E82B2B"/>
   </w:rsids>
   <m:mathPr>
     <m:mathFont m:val="Cambria Math"/>

</xml_diff>